<commit_message>
Replace "compulsion" with "mandatory" throughout the One Earth set
Two reasons. "Compulsion" carries a coercive valence the finding does not
intend: citizens prefer binding collective mechanisms, which "citizens
choose compulsion" makes sound perverse. And it diverged from the paper own
term, which is "mandatory" in the title, abstract and every figure.

"Direct regulation" was considered and rejected as inaccurate. In the
standard instrument typology a tax is a market-based instrument rather than
command-and-control, so the mandatory category here spans one economic
instrument and one regulatory requirement. Only "mandatory" covers both.

Five occurrences in the manuscript and cover letter, three in the graphical
abstract script. Manuscript, cover letter and graphical abstract rebuilt.

Co-Authored-By: Claude Opus 5 <noreply@anthropic.com>
</commit_message>
<xml_diff>
--- a/paper/Cover_OE.docx
+++ b/paper/Cover_OE.docx
@@ -59,7 +59,7 @@
         <w:pStyle w:val="BodyText"/>
       </w:pPr>
       <w:r>
-        <w:t xml:space="preserve">Your inquiry response asked how the design distinguishes preferences for mandatory versus voluntary instruments from related considerations such as cost incidence, perceived effectiveness, monitoring and responsibility for biodiversity impacts. The factorial design varies monitoring, land ownership and cost independently of the financing instrument, so those are estimated as separate coefficients. The instrument attribute itself crosses compulsion with incidence, tax and offsetting being mandatory but falling on households and corporates respectively, so the two can be read apart rather than being confounded. Perceived effectiveness is measured separately and after the choice tasks, and is reported as associational validation rather than mediation. We have made this structure explicit in the Results.</w:t>
+        <w:t xml:space="preserve">Your inquiry response asked how the design distinguishes preferences for mandatory versus voluntary instruments from related considerations such as cost incidence, perceived effectiveness, monitoring and responsibility for biodiversity impacts. The factorial design varies monitoring, land ownership and cost independently of the financing instrument, so those are estimated as separate coefficients. The instrument attribute itself crosses whether an instrument is mandatory with who bears its cost, tax and offsetting being mandatory but falling on households and corporates respectively, so the two can be read apart rather than being confounded. Perceived effectiveness is measured separately and after the choice tasks, and is reported as associational validation rather than mediation. We have made this structure explicit in the Results.</w:t>
       </w:r>
     </w:p>
     <w:p>
@@ -67,7 +67,7 @@
         <w:pStyle w:val="BodyText"/>
       </w:pPr>
       <w:r>
-        <w:t xml:space="preserve">That question also led to a finding we had not previously drawn out. Two judgements about the state can be separated, and they act in opposite directions: distrust of the state as a steward of conservation funds shifts preferences toward voluntary instruments, whereas doubt that the state will deliver on its biodiversity commitments does not, and if anything strengthens opposition to voluntary donation. The two correlate only weakly. Underprovision therefore generates demand for compulsion while distrust generates demand for alternatives to the state, which sharpens the cross-national prediction the paper offers.</w:t>
+        <w:t xml:space="preserve">That question also led to a finding we had not previously drawn out. Two judgements about the state can be separated, and they act in opposite directions: distrust of the state as a steward of conservation funds shifts preferences toward voluntary instruments, whereas doubt that the state will deliver on its biodiversity commitments does not, and if anything strengthens opposition to voluntary donation. The two correlate only weakly. Underprovision therefore generates demand for mandatory instruments while distrust generates demand for alternatives to the state, which sharpens the cross-national prediction the paper offers.</w:t>
       </w:r>
     </w:p>
     <w:p>

</xml_diff>